<commit_message>
Formato hibrido: citacoes do Curso em forma indireta, sem lacunas
Converte as citacoes do Curso de Direito Ambiental de diretas para
indiretas (parafrase com autoria), forma em que a NBR 10520 dispensa a
indicacao de pagina. Elimina os marcadores "p. ___" dos dois arquivos.

As citacoes diretas passam a vir apenas das fontes integralmente
paginadas: SARLET (GEN Juridico, 2020) no trabalho do Giovanni;
MOREIRA, LIMA e MOREIRA (Veredas do Direito, 2019) e os acordaos do STJ
no do Vinicius.

Giovanni mantem 5 remissoes ao Curso; Vinicius, 4.

Co-Authored-By: Claude Opus 5 <noreply@anthropic.com>
Claude-Session: https://claude.ai/code/session_01M7XSvztf93z6igBu6VCTNA
</commit_message>
<xml_diff>
--- a/trabalhos-direito-ambiental/Vinicius da Cruz Moreira - RGM 182.181 - Direito Ambiental - Principio do Poluidor-Pagador.docx
+++ b/trabalhos-direito-ambiental/Vinicius da Cruz Moreira - RGM 182.181 - Direito Ambiental - Principio do Poluidor-Pagador.docx
@@ -117,7 +117,83 @@
           <w:sz w:val="24"/>
           <w:szCs w:val="24"/>
         </w:rPr>
-        <w:t xml:space="preserve">Sarlet e Fensterseifer põem o dedo nesse ponto ao descrever a relação entre o processo civilizatório e os serviços ecossistêmicos:</w:t>
+        <w:t xml:space="preserve">Sarlet e Fensterseifer põem o dedo nesse ponto ao observar que o caminho civilizatório percorrido até aqui se deu de ombros para a Natureza e para as soluções que ela nos provê gratuitamente por meio dos serviços ambientais — entre eles a regulação climática, o sequestro de carbono, a purificação do ar, a moderação de eventos climáticos extremos, a manutenção do equilíbrio do ciclo hidrológico e o controle de enchentes, secas, erosão e deslizamentos de encostas (SARLET; FENSTERSEIFER, 2026).</w:t>
+      </w:r>
+    </w:p>
+    <w:p>
+      <w:pPr>
+        <w:spacing w:line="360" w:lineRule="auto"/>
+        <w:ind w:firstLine="709"/>
+        <w:jc w:val="both"/>
+      </w:pPr>
+      <w:r>
+        <w:rPr>
+          <w:rFonts w:ascii="Times New Roman" w:cs="Times New Roman" w:eastAsia="Times New Roman" w:hAnsi="Times New Roman"/>
+          <w:sz w:val="24"/>
+          <w:szCs w:val="24"/>
+        </w:rPr>
+        <w:t xml:space="preserve">O advérbio é o que importa: gratuitamente. Um bem de valor altíssimo e preço zero. Os autores atribuem esse desprezo a uma causa que vale registrar — a soberba de uma espécie que, crendo-se dotada de inteligência superior, menosprezou a própria tecnologia da Natureza (SARLET; FENSTERSEIFER, 2026).</w:t>
+      </w:r>
+    </w:p>
+    <w:p>
+      <w:pPr>
+        <w:spacing w:line="360" w:lineRule="auto"/>
+        <w:ind w:firstLine="709"/>
+        <w:jc w:val="both"/>
+      </w:pPr>
+      <w:r>
+        <w:rPr>
+          <w:rFonts w:ascii="Times New Roman" w:cs="Times New Roman" w:eastAsia="Times New Roman" w:hAnsi="Times New Roman"/>
+          <w:sz w:val="24"/>
+          <w:szCs w:val="24"/>
+        </w:rPr>
+        <w:t xml:space="preserve">Essa é a raiz do problema que o princípio do poluidor-pagador tenta resolver, e é por ela que este trabalho começa. Serão examinados o problema econômico que o princípio enfrenta, sua tradução no direito positivo brasileiro, o mal-entendido que o acompanha desde a origem e, ao final, sua aplicação concreta pelo Superior Tribunal de Justiça no REsp 1.198.727/MG.</w:t>
+      </w:r>
+    </w:p>
+    <w:p>
+      <w:pPr>
+        <w:spacing w:after="240" w:before="360" w:line="360" w:lineRule="auto"/>
+        <w:jc w:val="left"/>
+      </w:pPr>
+      <w:r>
+        <w:rPr>
+          <w:rFonts w:ascii="Times New Roman" w:cs="Times New Roman" w:eastAsia="Times New Roman" w:hAnsi="Times New Roman"/>
+          <w:b/>
+          <w:bCs/>
+          <w:sz w:val="24"/>
+          <w:szCs w:val="24"/>
+        </w:rPr>
+        <w:t xml:space="preserve">2 O PROBLEMA: EXTERNALIDADE E PREÇO FALSO</w:t>
+      </w:r>
+    </w:p>
+    <w:p>
+      <w:pPr>
+        <w:spacing w:line="360" w:lineRule="auto"/>
+        <w:ind w:firstLine="709"/>
+        <w:jc w:val="both"/>
+      </w:pPr>
+      <w:r>
+        <w:rPr>
+          <w:rFonts w:ascii="Times New Roman" w:cs="Times New Roman" w:eastAsia="Times New Roman" w:hAnsi="Times New Roman"/>
+          <w:sz w:val="24"/>
+          <w:szCs w:val="24"/>
+        </w:rPr>
+        <w:t xml:space="preserve">A economia chama de externalidade negativa o custo que uma atividade impõe a terceiros sem que ele apareça na contabilidade de quem a exerce. Uma indústria despeja efluentes no rio. Ela economiza o tratamento e amplia a margem. O rio deixa de servir à pesca, ao abastecimento e ao lazer de quem vive ali. A conta existe — só não é paga por quem a gerou. Na definição de Antonio Herman Benjamin, "tais custos, porque não computados no processo de produção, são uma externalidade ou custo externo" (BENJAMIN, 1993, p. 229).</w:t>
+      </w:r>
+    </w:p>
+    <w:p>
+      <w:pPr>
+        <w:spacing w:line="360" w:lineRule="auto"/>
+        <w:ind w:firstLine="709"/>
+        <w:jc w:val="both"/>
+      </w:pPr>
+      <w:r>
+        <w:rPr>
+          <w:rFonts w:ascii="Times New Roman" w:cs="Times New Roman" w:eastAsia="Times New Roman" w:hAnsi="Times New Roman"/>
+          <w:sz w:val="24"/>
+          <w:szCs w:val="24"/>
+        </w:rPr>
+        <w:t xml:space="preserve">É contra essa lacuna que o princípio opera. Moreira, Lima e Moreira o descrevem como princípio</w:t>
       </w:r>
     </w:p>
     <w:p>
@@ -132,37 +208,67 @@
           <w:sz w:val="20"/>
           <w:szCs w:val="20"/>
         </w:rPr>
-        <w:t xml:space="preserve">O nosso caminho civilizatório percorrido até aqui deu-se de ombros para a Natureza e as soluções que ela nos provê (gratuitamente) por meio dos serviços ambientais (ex.: regulação climática, sequestro de carbono, a purificação do ar, a moderação de eventos climáticos extremos, a manutenção do equilíbrio do ciclo hidrológico, a minimização de enchentes e secas e o controle dos processos críticos de erosão e de deslizamento de encostas etc.). (SARLET; FENSTERSEIFER, 2026, p. ___)</w:t>
-      </w:r>
-    </w:p>
-    <w:p>
-      <w:pPr>
-        <w:spacing w:line="360" w:lineRule="auto"/>
-        <w:ind w:firstLine="709"/>
-        <w:jc w:val="both"/>
-      </w:pPr>
-      <w:r>
-        <w:rPr>
-          <w:rFonts w:ascii="Times New Roman" w:cs="Times New Roman" w:eastAsia="Times New Roman" w:hAnsi="Times New Roman"/>
-          <w:sz w:val="24"/>
-          <w:szCs w:val="24"/>
-        </w:rPr>
-        <w:t xml:space="preserve">O parêntese é o que importa: gratuitamente. Um bem de valor altíssimo e preço zero. Os autores atribuem esse desprezo a uma causa que vale registrar: "A “tecnologia” da Natureza foi, em grande parte, menosprezada pelo ser humano, o que se deve, em grande medida, à soberba da nossa espécie ao crer na sua inteligência (supostamente) superior" (SARLET; FENSTERSEIFER, 2026, p. ___).</w:t>
-      </w:r>
-    </w:p>
-    <w:p>
-      <w:pPr>
-        <w:spacing w:line="360" w:lineRule="auto"/>
-        <w:ind w:firstLine="709"/>
-        <w:jc w:val="both"/>
-      </w:pPr>
-      <w:r>
-        <w:rPr>
-          <w:rFonts w:ascii="Times New Roman" w:cs="Times New Roman" w:eastAsia="Times New Roman" w:hAnsi="Times New Roman"/>
-          <w:sz w:val="24"/>
-          <w:szCs w:val="24"/>
-        </w:rPr>
-        <w:t xml:space="preserve">Essa é a raiz do problema que o princípio do poluidor-pagador tenta resolver, e é por ela que este trabalho começa. Serão examinados o problema econômico que o princípio enfrenta, sua tradução no direito positivo brasileiro, o mal-entendido que o acompanha desde a origem e, ao final, sua aplicação concreta pelo Superior Tribunal de Justiça no REsp 1.198.727/MG.</w:t>
+        <w:t xml:space="preserve">voltado para a internalização dos custos ambientais no funcionamento de atividades potencialmente poluidoras. À luz deste princípio, pretende-se que as externalidades ambientais negativas – ou, em outras palavras, os custos ambientais externos – sejam computados como custos de produção. (MOREIRA; LIMA; MOREIRA, 2019, p. 369)</w:t>
+      </w:r>
+    </w:p>
+    <w:p>
+      <w:pPr>
+        <w:spacing w:line="360" w:lineRule="auto"/>
+        <w:ind w:firstLine="709"/>
+        <w:jc w:val="both"/>
+      </w:pPr>
+      <w:r>
+        <w:rPr>
+          <w:rFonts w:ascii="Times New Roman" w:cs="Times New Roman" w:eastAsia="Times New Roman" w:hAnsi="Times New Roman"/>
+          <w:sz w:val="24"/>
+          <w:szCs w:val="24"/>
+        </w:rPr>
+        <w:t xml:space="preserve">A origem é econômica, e anterior à jurídica. As autoras registram que, em 1972, o princípio "recebeu a atenção da Organização para Cooperação e Desenvolvimento Econômico (OCDE) e foi incorporado em sua Recomendação sobre Princípios Relacionados aos Aspectos Econômicos Internacionais das Políticas Ambientais (C(72) 128, de 26.05.1972)", acrescentando um dado que costuma escapar: "Neste primeiro documento, atribuiu-se ao poluidor apenas os custos de prevenção da poluição" (MOREIRA; LIMA; MOREIRA, 2019, p. 370). A extensão do princípio aos custos de reparação do dano veio depois.</w:t>
+      </w:r>
+    </w:p>
+    <w:p>
+      <w:pPr>
+        <w:spacing w:line="360" w:lineRule="auto"/>
+        <w:ind w:firstLine="709"/>
+        <w:jc w:val="both"/>
+      </w:pPr>
+      <w:r>
+        <w:rPr>
+          <w:rFonts w:ascii="Times New Roman" w:cs="Times New Roman" w:eastAsia="Times New Roman" w:hAnsi="Times New Roman"/>
+          <w:sz w:val="24"/>
+          <w:szCs w:val="24"/>
+        </w:rPr>
+        <w:t xml:space="preserve">O detalhe não é curiosidade histórica. Ele mostra que o poluidor-pagador nasceu voltado para a prevenção, e só mais tarde ganhou a face reparatória que hoje predomina na prática forense brasileira. A lógica, em ambas as facetas, é a mesma: enquanto degradar for gratuito, degradar é economicamente racional; internalizado o custo, prevenir passa a ser mais barato que reparar. O princípio funciona como instrumento de indução de comportamento, e não apenas como regra de partilha de prejuízos depois do fato consumado.</w:t>
+      </w:r>
+    </w:p>
+    <w:p>
+      <w:pPr>
+        <w:spacing w:line="360" w:lineRule="auto"/>
+        <w:ind w:firstLine="709"/>
+        <w:jc w:val="both"/>
+      </w:pPr>
+      <w:r>
+        <w:rPr>
+          <w:rFonts w:ascii="Times New Roman" w:cs="Times New Roman" w:eastAsia="Times New Roman" w:hAnsi="Times New Roman"/>
+          <w:sz w:val="24"/>
+          <w:szCs w:val="24"/>
+        </w:rPr>
+        <w:t xml:space="preserve">Há ainda uma dimensão distributiva que os manuais costumam omitir e que Sarlet e Fensterseifer registram com precisão ao tratar da ética intrageracional. Referindo-se aos povos que hoje sofrem as consequências da crise ecológica, registram que muitos suportam injustamente o ônus e as externalidades ecológicas negativas decorrentes dos altos padrões industriais e de consumo dos países desenvolvidos (SARLET; FENSTERSEIFER, 2026).</w:t>
+      </w:r>
+    </w:p>
+    <w:p>
+      <w:pPr>
+        <w:spacing w:line="360" w:lineRule="auto"/>
+        <w:ind w:firstLine="709"/>
+        <w:jc w:val="both"/>
+      </w:pPr>
+      <w:r>
+        <w:rPr>
+          <w:rFonts w:ascii="Times New Roman" w:cs="Times New Roman" w:eastAsia="Times New Roman" w:hAnsi="Times New Roman"/>
+          <w:sz w:val="24"/>
+          <w:szCs w:val="24"/>
+        </w:rPr>
+        <w:t xml:space="preserve">A observação importa ao jurista, e não só ao economista. A externalidade não se dissolve no ar: ela desce, e desce sempre na mesma direção. De quem produz para quem não consome. Do país industrializado para o país fornecedor de matéria-prima. Da empresa para a comunidade ribeirinha. Internalizar custos, nesse quadro, não é refinamento de contabilidade ambiental — é exigência de justiça distributiva.</w:t>
       </w:r>
     </w:p>
     <w:p>
@@ -178,37 +284,204 @@
           <w:sz w:val="24"/>
           <w:szCs w:val="24"/>
         </w:rPr>
-        <w:t xml:space="preserve">2 O PROBLEMA: EXTERNALIDADE E PREÇO FALSO</w:t>
-      </w:r>
-    </w:p>
-    <w:p>
-      <w:pPr>
-        <w:spacing w:line="360" w:lineRule="auto"/>
-        <w:ind w:firstLine="709"/>
-        <w:jc w:val="both"/>
-      </w:pPr>
-      <w:r>
-        <w:rPr>
-          <w:rFonts w:ascii="Times New Roman" w:cs="Times New Roman" w:eastAsia="Times New Roman" w:hAnsi="Times New Roman"/>
-          <w:sz w:val="24"/>
-          <w:szCs w:val="24"/>
-        </w:rPr>
-        <w:t xml:space="preserve">A economia chama de externalidade negativa o custo que uma atividade impõe a terceiros sem que ele apareça na contabilidade de quem a exerce. Uma indústria despeja efluentes no rio. Ela economiza o tratamento e amplia a margem. O rio deixa de servir à pesca, ao abastecimento e ao lazer de quem vive ali. A conta existe — só não é paga por quem a gerou. Na definição de Antonio Herman Benjamin, "tais custos, porque não computados no processo de produção, são uma externalidade ou custo externo" (BENJAMIN, 1993, p. 229).</w:t>
-      </w:r>
-    </w:p>
-    <w:p>
-      <w:pPr>
-        <w:spacing w:line="360" w:lineRule="auto"/>
-        <w:ind w:firstLine="709"/>
-        <w:jc w:val="both"/>
-      </w:pPr>
-      <w:r>
-        <w:rPr>
-          <w:rFonts w:ascii="Times New Roman" w:cs="Times New Roman" w:eastAsia="Times New Roman" w:hAnsi="Times New Roman"/>
-          <w:sz w:val="24"/>
-          <w:szCs w:val="24"/>
-        </w:rPr>
-        <w:t xml:space="preserve">É contra essa lacuna que o princípio opera. Moreira, Lima e Moreira o descrevem como princípio</w:t>
+        <w:t xml:space="preserve">3 A TRADUÇÃO NORMATIVA NO DIREITO BRASILEIRO</w:t>
+      </w:r>
+    </w:p>
+    <w:p>
+      <w:pPr>
+        <w:spacing w:line="360" w:lineRule="auto"/>
+        <w:ind w:firstLine="709"/>
+        <w:jc w:val="both"/>
+      </w:pPr>
+      <w:r>
+        <w:rPr>
+          <w:rFonts w:ascii="Times New Roman" w:cs="Times New Roman" w:eastAsia="Times New Roman" w:hAnsi="Times New Roman"/>
+          <w:sz w:val="24"/>
+          <w:szCs w:val="24"/>
+        </w:rPr>
+        <w:t xml:space="preserve">No ordenamento brasileiro o princípio tem assento expresso, e não apenas implícito.</w:t>
+      </w:r>
+    </w:p>
+    <w:p>
+      <w:pPr>
+        <w:spacing w:line="360" w:lineRule="auto"/>
+        <w:ind w:firstLine="709"/>
+        <w:jc w:val="both"/>
+      </w:pPr>
+      <w:r>
+        <w:rPr>
+          <w:rFonts w:ascii="Times New Roman" w:cs="Times New Roman" w:eastAsia="Times New Roman" w:hAnsi="Times New Roman"/>
+          <w:sz w:val="24"/>
+          <w:szCs w:val="24"/>
+        </w:rPr>
+        <w:t xml:space="preserve">O art. 4º, VII, da Lei n. 6.938/1981 fixa, entre os objetivos da Política Nacional do Meio Ambiente, a imposição ao poluidor da obrigação de recuperar e/ou indenizar os danos causados, e ao usuário da contribuição pela utilização de recursos ambientais com fins econômicos. Estão ali, no mesmo dispositivo, os dois princípios gêmeos: poluidor-pagador e usuário-pagador.</w:t>
+      </w:r>
+    </w:p>
+    <w:p>
+      <w:pPr>
+        <w:spacing w:line="360" w:lineRule="auto"/>
+        <w:ind w:firstLine="709"/>
+        <w:jc w:val="both"/>
+      </w:pPr>
+      <w:r>
+        <w:rPr>
+          <w:rFonts w:ascii="Times New Roman" w:cs="Times New Roman" w:eastAsia="Times New Roman" w:hAnsi="Times New Roman"/>
+          <w:sz w:val="24"/>
+          <w:szCs w:val="24"/>
+        </w:rPr>
+        <w:t xml:space="preserve">O art. 14, § 1º, da mesma lei completa o desenho ao consagrar a responsabilidade objetiva do poluidor, independentemente de culpa. E o art. 225, § 3º, da Constituição estabelece que as condutas lesivas ao meio ambiente sujeitam os infratores a sanções penais e administrativas, independentemente da obrigação de reparar os danos — a tríplice responsabilização ambiental.</w:t>
+      </w:r>
+    </w:p>
+    <w:p>
+      <w:pPr>
+        <w:spacing w:line="360" w:lineRule="auto"/>
+        <w:ind w:firstLine="709"/>
+        <w:jc w:val="both"/>
+      </w:pPr>
+      <w:r>
+        <w:rPr>
+          <w:rFonts w:ascii="Times New Roman" w:cs="Times New Roman" w:eastAsia="Times New Roman" w:hAnsi="Times New Roman"/>
+          <w:sz w:val="24"/>
+          <w:szCs w:val="24"/>
+        </w:rPr>
+        <w:t xml:space="preserve">A soma desses dispositivos produz regime severo: bastam conduta, dano e nexo causal. Não se discute intenção, diligência ou licença. A severidade não é acidente legislativo, e sim condição de funcionamento do princípio. Um regime de responsabilidade subjetiva devolveria à coletividade todo o custo que não conseguisse ser provado — e prova de culpa, em degradação difusa, é quase sempre inviável.</w:t>
+      </w:r>
+    </w:p>
+    <w:p>
+      <w:pPr>
+        <w:spacing w:after="240" w:before="360" w:line="360" w:lineRule="auto"/>
+        <w:jc w:val="left"/>
+      </w:pPr>
+      <w:r>
+        <w:rPr>
+          <w:rFonts w:ascii="Times New Roman" w:cs="Times New Roman" w:eastAsia="Times New Roman" w:hAnsi="Times New Roman"/>
+          <w:b/>
+          <w:bCs/>
+          <w:sz w:val="24"/>
+          <w:szCs w:val="24"/>
+        </w:rPr>
+        <w:t xml:space="preserve">4 O MAL-ENTENDIDO: O PRINCÍPIO NÃO AUTORIZA POLUIR</w:t>
+      </w:r>
+    </w:p>
+    <w:p>
+      <w:pPr>
+        <w:spacing w:line="360" w:lineRule="auto"/>
+        <w:ind w:firstLine="709"/>
+        <w:jc w:val="both"/>
+      </w:pPr>
+      <w:r>
+        <w:rPr>
+          <w:rFonts w:ascii="Times New Roman" w:cs="Times New Roman" w:eastAsia="Times New Roman" w:hAnsi="Times New Roman"/>
+          <w:sz w:val="24"/>
+          <w:szCs w:val="24"/>
+        </w:rPr>
+        <w:t xml:space="preserve">Existe uma leitura equivocada do princípio que precisa ser afastada explicitamente, porque aparece até em petições.</w:t>
+      </w:r>
+    </w:p>
+    <w:p>
+      <w:pPr>
+        <w:spacing w:line="360" w:lineRule="auto"/>
+        <w:ind w:firstLine="709"/>
+        <w:jc w:val="both"/>
+      </w:pPr>
+      <w:r>
+        <w:rPr>
+          <w:rFonts w:ascii="Times New Roman" w:cs="Times New Roman" w:eastAsia="Times New Roman" w:hAnsi="Times New Roman"/>
+          <w:sz w:val="24"/>
+          <w:szCs w:val="24"/>
+        </w:rPr>
+        <w:t xml:space="preserve">Lido às pressas, "poluidor-pagador" sugeriria que quem paga pode poluir. A inversão tem nome na doutrina. Registram Moreira, Lima e Moreira que, "para Nicolas de Sadeleer, o poluidor não pode pensar que, se paga, tem o direito de poluir, o que seria distorcer o princípio em “pagador-poluidor”, ao invés de “poluidor-pagador”" (MOREIRA; LIMA; MOREIRA, 2019, p. 372).</w:t>
+      </w:r>
+    </w:p>
+    <w:p>
+      <w:pPr>
+        <w:spacing w:line="360" w:lineRule="auto"/>
+        <w:ind w:firstLine="709"/>
+        <w:jc w:val="both"/>
+      </w:pPr>
+      <w:r>
+        <w:rPr>
+          <w:rFonts w:ascii="Times New Roman" w:cs="Times New Roman" w:eastAsia="Times New Roman" w:hAnsi="Times New Roman"/>
+          <w:sz w:val="24"/>
+          <w:szCs w:val="24"/>
+        </w:rPr>
+        <w:t xml:space="preserve">A recusa dessa leitura é firme na doutrina brasileira. Marcelo Abelha Rodrigues, citado pelas mesmas autoras, sustenta que o princípio passa longe do sentido de "pago para poder poluir", não apenas porque o custo ambiental não encontra valoração pecuniária correspondente, mas "também porque a ninguém poderia ser dada a possibilidade de comprar o direito de poluir, beneficiando-se do bem ambiental em detrimento da coletividade que dele é titular" (RODRIGUES apud MOREIRA; LIMA; MOREIRA, 2019, p. 372).</w:t>
+      </w:r>
+    </w:p>
+    <w:p>
+      <w:pPr>
+        <w:spacing w:line="360" w:lineRule="auto"/>
+        <w:ind w:firstLine="709"/>
+        <w:jc w:val="both"/>
+      </w:pPr>
+      <w:r>
+        <w:rPr>
+          <w:rFonts w:ascii="Times New Roman" w:cs="Times New Roman" w:eastAsia="Times New Roman" w:hAnsi="Times New Roman"/>
+          <w:sz w:val="24"/>
+          <w:szCs w:val="24"/>
+        </w:rPr>
+        <w:t xml:space="preserve">O argumento é duplo e vale a pena separá-lo. O primeiro é de ordem prática: não há preço que corresponda ao bem perdido, de modo que o pagamento nunca equivale à degradação. O segundo é de ordem estrutural e mais forte: o meio ambiente é bem de uso comum do povo, e ninguém compra o que não pertence ao vendedor. O princípio incide sobre a poluição juridicamente tolerada — a que se mantém dentro dos padrões legais e das condições da licença — e não sobre o ilícito, que continua sujeito a sanção administrativa e penal, além do dever de reparar. Pagar não convalida ilicitude. Quem degrada sem licença, ou além dos limites da que possui, não comprou nada: apenas passou a dever mais.</w:t>
+      </w:r>
+    </w:p>
+    <w:p>
+      <w:pPr>
+        <w:spacing w:after="240" w:before="360" w:line="360" w:lineRule="auto"/>
+        <w:jc w:val="left"/>
+      </w:pPr>
+      <w:r>
+        <w:rPr>
+          <w:rFonts w:ascii="Times New Roman" w:cs="Times New Roman" w:eastAsia="Times New Roman" w:hAnsi="Times New Roman"/>
+          <w:b/>
+          <w:bCs/>
+          <w:sz w:val="24"/>
+          <w:szCs w:val="24"/>
+        </w:rPr>
+        <w:t xml:space="preserve">5 A APLICAÇÃO CONCRETA: O REsp 1.198.727/MG</w:t>
+      </w:r>
+    </w:p>
+    <w:p>
+      <w:pPr>
+        <w:spacing w:line="360" w:lineRule="auto"/>
+        <w:ind w:firstLine="709"/>
+        <w:jc w:val="both"/>
+      </w:pPr>
+      <w:r>
+        <w:rPr>
+          <w:rFonts w:ascii="Times New Roman" w:cs="Times New Roman" w:eastAsia="Times New Roman" w:hAnsi="Times New Roman"/>
+          <w:sz w:val="24"/>
+          <w:szCs w:val="24"/>
+        </w:rPr>
+        <w:t xml:space="preserve">O julgamento do Recurso Especial n. 1.198.727/MG pela Segunda Turma do Superior Tribunal de Justiça, sob relatoria do Ministro Herman Benjamin, em 14 de agosto de 2012, com acórdão publicado no DJe de 9 de maio de 2013, mostra o princípio operando dentro do processo.</w:t>
+      </w:r>
+    </w:p>
+    <w:p>
+      <w:pPr>
+        <w:spacing w:line="360" w:lineRule="auto"/>
+        <w:ind w:firstLine="709"/>
+        <w:jc w:val="both"/>
+      </w:pPr>
+      <w:r>
+        <w:rPr>
+          <w:rFonts w:ascii="Times New Roman" w:cs="Times New Roman" w:eastAsia="Times New Roman" w:hAnsi="Times New Roman"/>
+          <w:sz w:val="24"/>
+          <w:szCs w:val="24"/>
+        </w:rPr>
+        <w:t xml:space="preserve">O caso teve origem em ação civil pública ajuizada em razão do desmatamento de vegetação nativa de Cerrado, sem autorização do órgão ambiental competente. A controvérsia era objetiva: condenado o réu a recuperar a área degradada, poderia ser condenado, cumulativamente, a indenizar em dinheiro? Ou a recuperação esgotaria a reparação devida, configurando a cumulação um bis in idem?</w:t>
+      </w:r>
+    </w:p>
+    <w:p>
+      <w:pPr>
+        <w:spacing w:line="360" w:lineRule="auto"/>
+        <w:ind w:firstLine="709"/>
+        <w:jc w:val="both"/>
+      </w:pPr>
+      <w:r>
+        <w:rPr>
+          <w:rFonts w:ascii="Times New Roman" w:cs="Times New Roman" w:eastAsia="Times New Roman" w:hAnsi="Times New Roman"/>
+          <w:sz w:val="24"/>
+          <w:szCs w:val="24"/>
+        </w:rPr>
+        <w:t xml:space="preserve">O obstáculo era textual. O art. 4º, VII, da Lei n. 6.938/1981 fala em recuperar "e/ou" indenizar, e o réu sustentava que a conjunção alternativa excluiria a soma. O Tribunal rejeitou a leitura literal:</w:t>
       </w:r>
     </w:p>
     <w:p>
@@ -223,67 +496,97 @@
           <w:sz w:val="20"/>
           <w:szCs w:val="20"/>
         </w:rPr>
-        <w:t xml:space="preserve">voltado para a internalização dos custos ambientais no funcionamento de atividades potencialmente poluidoras. À luz deste princípio, pretende-se que as externalidades ambientais negativas – ou, em outras palavras, os custos ambientais externos – sejam computados como custos de produção. (MOREIRA; LIMA; MOREIRA, 2019, p. 369)</w:t>
-      </w:r>
-    </w:p>
-    <w:p>
-      <w:pPr>
-        <w:spacing w:line="360" w:lineRule="auto"/>
-        <w:ind w:firstLine="709"/>
-        <w:jc w:val="both"/>
-      </w:pPr>
-      <w:r>
-        <w:rPr>
-          <w:rFonts w:ascii="Times New Roman" w:cs="Times New Roman" w:eastAsia="Times New Roman" w:hAnsi="Times New Roman"/>
-          <w:sz w:val="24"/>
-          <w:szCs w:val="24"/>
-        </w:rPr>
-        <w:t xml:space="preserve">A origem é econômica, e anterior à jurídica. As autoras registram que, em 1972, o princípio "recebeu a atenção da Organização para Cooperação e Desenvolvimento Econômico (OCDE) e foi incorporado em sua Recomendação sobre Princípios Relacionados aos Aspectos Econômicos Internacionais das Políticas Ambientais (C(72) 128, de 26.05.1972)", acrescentando um dado que costuma escapar: "Neste primeiro documento, atribuiu-se ao poluidor apenas os custos de prevenção da poluição" (MOREIRA; LIMA; MOREIRA, 2019, p. 370). A extensão do princípio aos custos de reparação do dano veio depois.</w:t>
-      </w:r>
-    </w:p>
-    <w:p>
-      <w:pPr>
-        <w:spacing w:line="360" w:lineRule="auto"/>
-        <w:ind w:firstLine="709"/>
-        <w:jc w:val="both"/>
-      </w:pPr>
-      <w:r>
-        <w:rPr>
-          <w:rFonts w:ascii="Times New Roman" w:cs="Times New Roman" w:eastAsia="Times New Roman" w:hAnsi="Times New Roman"/>
-          <w:sz w:val="24"/>
-          <w:szCs w:val="24"/>
-        </w:rPr>
-        <w:t xml:space="preserve">O detalhe não é curiosidade histórica. Ele mostra que o poluidor-pagador nasceu voltado para a prevenção, e só mais tarde ganhou a face reparatória que hoje predomina na prática forense brasileira. A lógica, em ambas as facetas, é a mesma: enquanto degradar for gratuito, degradar é economicamente racional; internalizado o custo, prevenir passa a ser mais barato que reparar. O princípio funciona como instrumento de indução de comportamento, e não apenas como regra de partilha de prejuízos depois do fato consumado.</w:t>
-      </w:r>
-    </w:p>
-    <w:p>
-      <w:pPr>
-        <w:spacing w:line="360" w:lineRule="auto"/>
-        <w:ind w:firstLine="709"/>
-        <w:jc w:val="both"/>
-      </w:pPr>
-      <w:r>
-        <w:rPr>
-          <w:rFonts w:ascii="Times New Roman" w:cs="Times New Roman" w:eastAsia="Times New Roman" w:hAnsi="Times New Roman"/>
-          <w:sz w:val="24"/>
-          <w:szCs w:val="24"/>
-        </w:rPr>
-        <w:t xml:space="preserve">Há ainda uma dimensão distributiva que os manuais costumam omitir e que Sarlet e Fensterseifer registram com precisão ao tratar da ética intrageracional. Referindo-se aos povos que hoje sofrem as consequências da crise ecológica, escrevem que muitos suportam "injustamente o ônus e as externalidades ecológicas negativas decorrentes dos altos padrões industriais e de consumo dos países desenvolvidos" (SARLET; FENSTERSEIFER, 2026, p. ___).</w:t>
-      </w:r>
-    </w:p>
-    <w:p>
-      <w:pPr>
-        <w:spacing w:line="360" w:lineRule="auto"/>
-        <w:ind w:firstLine="709"/>
-        <w:jc w:val="both"/>
-      </w:pPr>
-      <w:r>
-        <w:rPr>
-          <w:rFonts w:ascii="Times New Roman" w:cs="Times New Roman" w:eastAsia="Times New Roman" w:hAnsi="Times New Roman"/>
-          <w:sz w:val="24"/>
-          <w:szCs w:val="24"/>
-        </w:rPr>
-        <w:t xml:space="preserve">A observação importa ao jurista, e não só ao economista. A externalidade não se dissolve no ar: ela desce, e desce sempre na mesma direção. De quem produz para quem não consome. Do país industrializado para o país fornecedor de matéria-prima. Da empresa para a comunidade ribeirinha. Internalizar custos, nesse quadro, não é refinamento de contabilidade ambiental — é exigência de justiça distributiva.</w:t>
+        <w:t xml:space="preserve">a conjunção “ou” contida na citada norma (assim como nos arts. 4º, VII, e 14, § 1º, da Lei 6.938/1981) opera com valor aditivo, não introduz alternativa excludente. Vedar a cumulação desses remédios limitaria, de forma indesejada, a Ação Civil Pública, instrumento de persecução da responsabilidade civil de danos causados ao meio ambiente, por exemplo inviabilizando a condenação em dano moral coletivo. (STJ, REsp 1.198.727/MG, Rel. Min. Herman Benjamin, 2ª Turma, j. 14 ago. 2012)</w:t>
+      </w:r>
+    </w:p>
+    <w:p>
+      <w:pPr>
+        <w:spacing w:line="360" w:lineRule="auto"/>
+        <w:ind w:firstLine="709"/>
+        <w:jc w:val="both"/>
+      </w:pPr>
+      <w:r>
+        <w:rPr>
+          <w:rFonts w:ascii="Times New Roman" w:cs="Times New Roman" w:eastAsia="Times New Roman" w:hAnsi="Times New Roman"/>
+          <w:sz w:val="24"/>
+          <w:szCs w:val="24"/>
+        </w:rPr>
+        <w:t xml:space="preserve">A decisão fundou-se nos princípios da reparação integral, do poluidor-pagador e do usuário-pagador. E o raciocínio é coerente com tudo o que se expôs até aqui: replantar não repõe o que se perdeu. Entre o desmatamento e a recomposição efetiva da vegetação decorre um período que, no Cerrado, se conta em décadas, e durante todo esse intervalo a coletividade fica privada dos serviços ecossistêmicos que a área prestava.</w:t>
+      </w:r>
+    </w:p>
+    <w:p>
+      <w:pPr>
+        <w:spacing w:line="360" w:lineRule="auto"/>
+        <w:ind w:firstLine="709"/>
+        <w:jc w:val="both"/>
+      </w:pPr>
+      <w:r>
+        <w:rPr>
+          <w:rFonts w:ascii="Times New Roman" w:cs="Times New Roman" w:eastAsia="Times New Roman" w:hAnsi="Times New Roman"/>
+          <w:sz w:val="24"/>
+          <w:szCs w:val="24"/>
+        </w:rPr>
+        <w:t xml:space="preserve">O Superior Tribunal de Justiça deu nome a essa parcela do prejuízo. Em julgado da mesma linha, assentou:</w:t>
+      </w:r>
+    </w:p>
+    <w:p>
+      <w:pPr>
+        <w:spacing w:after="240" w:before="240" w:line="240" w:lineRule="auto"/>
+        <w:ind w:left="2268"/>
+        <w:jc w:val="both"/>
+      </w:pPr>
+      <w:r>
+        <w:rPr>
+          <w:rFonts w:ascii="Times New Roman" w:cs="Times New Roman" w:eastAsia="Times New Roman" w:hAnsi="Times New Roman"/>
+          <w:sz w:val="20"/>
+          <w:szCs w:val="20"/>
+        </w:rPr>
+        <w:t xml:space="preserve">A reparação ambiental deve ser feita da forma mais completa possível, de modo que a condenação a recuperar a área lesionada não exclui o dever de indenizar, sobretudo pelo dano que permanece entre a sua ocorrência e o pleno restabelecimento do meio ambiente afetado (= dano interino ou intermediário), bem como pelo dano moral coletivo e pelo dano residual (= degradação ambiental que subsiste, não obstante todos os esforços de restauração). (STJ, REsp 1.180.078/MG, Rel. Min. Herman Benjamin, 2ª Turma)</w:t>
+      </w:r>
+    </w:p>
+    <w:p>
+      <w:pPr>
+        <w:spacing w:line="360" w:lineRule="auto"/>
+        <w:ind w:firstLine="709"/>
+        <w:jc w:val="both"/>
+      </w:pPr>
+      <w:r>
+        <w:rPr>
+          <w:rFonts w:ascii="Times New Roman" w:cs="Times New Roman" w:eastAsia="Times New Roman" w:hAnsi="Times New Roman"/>
+          <w:sz w:val="24"/>
+          <w:szCs w:val="24"/>
+        </w:rPr>
+        <w:t xml:space="preserve">Dano interino e dano residual são, em rigor, custos ambientais que a obrigação de fazer não alcança. Se a condenação parasse no replantio, essa parcela permaneceria externalizada, suportada por quem não a causou. A cumulação, portanto, não é excesso punitivo: é exigência do princípio.</w:t>
+      </w:r>
+    </w:p>
+    <w:p>
+      <w:pPr>
+        <w:spacing w:line="360" w:lineRule="auto"/>
+        <w:ind w:firstLine="709"/>
+        <w:jc w:val="both"/>
+      </w:pPr>
+      <w:r>
+        <w:rPr>
+          <w:rFonts w:ascii="Times New Roman" w:cs="Times New Roman" w:eastAsia="Times New Roman" w:hAnsi="Times New Roman"/>
+          <w:sz w:val="24"/>
+          <w:szCs w:val="24"/>
+        </w:rPr>
+        <w:t xml:space="preserve">O entendimento consolidou-se em enunciados que hoje estruturam a matéria. A Súmula 629 firma que, quanto ao dano ambiental, é admitida a condenação do réu à obrigação de fazer ou à de não fazer cumulada com a de indenizar. A Súmula 623 reconhece a natureza propter rem das obrigações ambientais, permitindo exigi-las do proprietário ou possuidor atual e/ou dos anteriores, à escolha do credor — solução que impede a fuga da responsabilidade pela simples venda do imóvel degradado. E a Súmula 618 atribui ao réu o ônus da prova nas ações de degradação ambiental, derrubando a barreira probatória que na prática inviabilizava a responsabilização.</w:t>
+      </w:r>
+    </w:p>
+    <w:p>
+      <w:pPr>
+        <w:spacing w:line="360" w:lineRule="auto"/>
+        <w:ind w:firstLine="709"/>
+        <w:jc w:val="both"/>
+      </w:pPr>
+      <w:r>
+        <w:rPr>
+          <w:rFonts w:ascii="Times New Roman" w:cs="Times New Roman" w:eastAsia="Times New Roman" w:hAnsi="Times New Roman"/>
+          <w:sz w:val="24"/>
+          <w:szCs w:val="24"/>
+        </w:rPr>
+        <w:t xml:space="preserve">Vistos em conjunto, os três enunciados fazem o que o princípio pede: impedem que o custo ambiental escape do agente por via processual, registral ou probatória.</w:t>
       </w:r>
     </w:p>
     <w:p>
@@ -299,67 +602,82 @@
           <w:sz w:val="24"/>
           <w:szCs w:val="24"/>
         </w:rPr>
-        <w:t xml:space="preserve">3 A TRADUÇÃO NORMATIVA NO DIREITO BRASILEIRO</w:t>
-      </w:r>
-    </w:p>
-    <w:p>
-      <w:pPr>
-        <w:spacing w:line="360" w:lineRule="auto"/>
-        <w:ind w:firstLine="709"/>
-        <w:jc w:val="both"/>
-      </w:pPr>
-      <w:r>
-        <w:rPr>
-          <w:rFonts w:ascii="Times New Roman" w:cs="Times New Roman" w:eastAsia="Times New Roman" w:hAnsi="Times New Roman"/>
-          <w:sz w:val="24"/>
-          <w:szCs w:val="24"/>
-        </w:rPr>
-        <w:t xml:space="preserve">No ordenamento brasileiro o princípio tem assento expresso, e não apenas implícito.</w:t>
-      </w:r>
-    </w:p>
-    <w:p>
-      <w:pPr>
-        <w:spacing w:line="360" w:lineRule="auto"/>
-        <w:ind w:firstLine="709"/>
-        <w:jc w:val="both"/>
-      </w:pPr>
-      <w:r>
-        <w:rPr>
-          <w:rFonts w:ascii="Times New Roman" w:cs="Times New Roman" w:eastAsia="Times New Roman" w:hAnsi="Times New Roman"/>
-          <w:sz w:val="24"/>
-          <w:szCs w:val="24"/>
-        </w:rPr>
-        <w:t xml:space="preserve">O art. 4º, VII, da Lei n. 6.938/1981 fixa, entre os objetivos da Política Nacional do Meio Ambiente, a imposição ao poluidor da obrigação de recuperar e/ou indenizar os danos causados, e ao usuário da contribuição pela utilização de recursos ambientais com fins econômicos. Estão ali, no mesmo dispositivo, os dois princípios gêmeos: poluidor-pagador e usuário-pagador.</w:t>
-      </w:r>
-    </w:p>
-    <w:p>
-      <w:pPr>
-        <w:spacing w:line="360" w:lineRule="auto"/>
-        <w:ind w:firstLine="709"/>
-        <w:jc w:val="both"/>
-      </w:pPr>
-      <w:r>
-        <w:rPr>
-          <w:rFonts w:ascii="Times New Roman" w:cs="Times New Roman" w:eastAsia="Times New Roman" w:hAnsi="Times New Roman"/>
-          <w:sz w:val="24"/>
-          <w:szCs w:val="24"/>
-        </w:rPr>
-        <w:t xml:space="preserve">O art. 14, § 1º, da mesma lei completa o desenho ao consagrar a responsabilidade objetiva do poluidor, independentemente de culpa. E o art. 225, § 3º, da Constituição estabelece que as condutas lesivas ao meio ambiente sujeitam os infratores a sanções penais e administrativas, independentemente da obrigação de reparar os danos — a tríplice responsabilização ambiental.</w:t>
-      </w:r>
-    </w:p>
-    <w:p>
-      <w:pPr>
-        <w:spacing w:line="360" w:lineRule="auto"/>
-        <w:ind w:firstLine="709"/>
-        <w:jc w:val="both"/>
-      </w:pPr>
-      <w:r>
-        <w:rPr>
-          <w:rFonts w:ascii="Times New Roman" w:cs="Times New Roman" w:eastAsia="Times New Roman" w:hAnsi="Times New Roman"/>
-          <w:sz w:val="24"/>
-          <w:szCs w:val="24"/>
-        </w:rPr>
-        <w:t xml:space="preserve">A soma desses dispositivos produz regime severo: bastam conduta, dano e nexo causal. Não se discute intenção, diligência ou licença. A severidade não é acidente legislativo, e sim condição de funcionamento do princípio. Um regime de responsabilidade subjetiva devolveria à coletividade todo o custo que não conseguisse ser provado — e prova de culpa, em degradação difusa, é quase sempre inviável.</w:t>
+        <w:t xml:space="preserve">6 CONCLUSÃO</w:t>
+      </w:r>
+    </w:p>
+    <w:p>
+      <w:pPr>
+        <w:spacing w:line="360" w:lineRule="auto"/>
+        <w:ind w:firstLine="709"/>
+        <w:jc w:val="both"/>
+      </w:pPr>
+      <w:r>
+        <w:rPr>
+          <w:rFonts w:ascii="Times New Roman" w:cs="Times New Roman" w:eastAsia="Times New Roman" w:hAnsi="Times New Roman"/>
+          <w:sz w:val="24"/>
+          <w:szCs w:val="24"/>
+        </w:rPr>
+        <w:t xml:space="preserve">O poluidor-pagador não é uma regra sobre quem paga a conta. É mecanismo de correção de falha de mercado. Sem ele, o preço dos bens produzidos não expressa seu custo real, e a degradação segue sendo a escolha racional para o agente econômico.</w:t>
+      </w:r>
+    </w:p>
+    <w:p>
+      <w:pPr>
+        <w:spacing w:line="360" w:lineRule="auto"/>
+        <w:ind w:firstLine="709"/>
+        <w:jc w:val="both"/>
+      </w:pPr>
+      <w:r>
+        <w:rPr>
+          <w:rFonts w:ascii="Times New Roman" w:cs="Times New Roman" w:eastAsia="Times New Roman" w:hAnsi="Times New Roman"/>
+          <w:sz w:val="24"/>
+          <w:szCs w:val="24"/>
+        </w:rPr>
+        <w:t xml:space="preserve">O REsp 1.198.727/MG mostra o princípio cumprindo essa função dentro do processo civil. Ao ler o "ou" legal como conjunção aditiva, o STJ recusou uma reparação apenas aparente e alocou integralmente o custo ambiental em quem o gerou. As Súmulas 618, 623 e 629 estenderam a lógica ao regime probatório e à transmissibilidade da obrigação. No plano normativo e jurisprudencial, o sistema brasileiro de responsabilidade civil ambiental tornou-se bastante robusto.</w:t>
+      </w:r>
+    </w:p>
+    <w:p>
+      <w:pPr>
+        <w:spacing w:line="360" w:lineRule="auto"/>
+        <w:ind w:firstLine="709"/>
+        <w:jc w:val="both"/>
+      </w:pPr>
+      <w:r>
+        <w:rPr>
+          <w:rFonts w:ascii="Times New Roman" w:cs="Times New Roman" w:eastAsia="Times New Roman" w:hAnsi="Times New Roman"/>
+          <w:sz w:val="24"/>
+          <w:szCs w:val="24"/>
+        </w:rPr>
+        <w:t xml:space="preserve">Cabe, porém, um registro crítico que a própria pesquisa consultada autoriza. Moreira, Lima e Moreira concluem que, embora o princípio tenha sido bem incorporado como fio condutor da reparação integral, sua dimensão preventiva permanece significativamente subutilizada pelos tribunais superiores (MOREIRA; LIMA; MOREIRA, 2019, p. 368). O dado é revelador quando se lembra que, na formulação original da OCDE, em 1972, prevenção era tudo o que o princípio exigia. Construímos um sistema eficiente para cobrar depois, e comparativamente tímido para impedir antes.</w:t>
+      </w:r>
+    </w:p>
+    <w:p>
+      <w:pPr>
+        <w:spacing w:line="360" w:lineRule="auto"/>
+        <w:ind w:firstLine="709"/>
+        <w:jc w:val="both"/>
+      </w:pPr>
+      <w:r>
+        <w:rPr>
+          <w:rFonts w:ascii="Times New Roman" w:cs="Times New Roman" w:eastAsia="Times New Roman" w:hAnsi="Times New Roman"/>
+          <w:sz w:val="24"/>
+          <w:szCs w:val="24"/>
+        </w:rPr>
+        <w:t xml:space="preserve">A observação encontra eco no próprio Curso. Ao tratar dos serviços prestados pelos ecossistemas, Sarlet e Fensterseifer registram que se discute cada vez mais, inclusive como princípio e dever jurídico, a priorização de soluções baseadas na Natureza, em consonância com uma ética do cuidado e com a prevenção e a precaução de danos ambientais, também em vista do futuro (SARLET; FENSTERSEIFER, 2026). Prevenir, nessa leitura, não é alternativa mais barata à reparação: é o próprio conteúdo do dever.</w:t>
+      </w:r>
+    </w:p>
+    <w:p>
+      <w:pPr>
+        <w:spacing w:line="360" w:lineRule="auto"/>
+        <w:ind w:firstLine="709"/>
+        <w:jc w:val="both"/>
+      </w:pPr>
+      <w:r>
+        <w:rPr>
+          <w:rFonts w:ascii="Times New Roman" w:cs="Times New Roman" w:eastAsia="Times New Roman" w:hAnsi="Times New Roman"/>
+          <w:sz w:val="24"/>
+          <w:szCs w:val="24"/>
+        </w:rPr>
+        <w:t xml:space="preserve">Some-se a isso a dificuldade de quantificar. Não há metodologia consolidada para medir o dano interino e converter em reais os serviços ecossistêmicos perdidos durante a regeneração. E aqui a questão volta ao ponto de partida. Enquanto a Natureza continuar sendo contabilizada como fornecedora gratuita, faltará ao juiz o parâmetro para calcular o que o poluidor deve. Sem preço, não há internalização — e a reparação integral corre o risco de permanecer, em boa medida, uma promessa bem escrita.</w:t>
       </w:r>
     </w:p>
     <w:p>
@@ -375,339 +693,6 @@
           <w:sz w:val="24"/>
           <w:szCs w:val="24"/>
         </w:rPr>
-        <w:t xml:space="preserve">4 O MAL-ENTENDIDO: O PRINCÍPIO NÃO AUTORIZA POLUIR</w:t>
-      </w:r>
-    </w:p>
-    <w:p>
-      <w:pPr>
-        <w:spacing w:line="360" w:lineRule="auto"/>
-        <w:ind w:firstLine="709"/>
-        <w:jc w:val="both"/>
-      </w:pPr>
-      <w:r>
-        <w:rPr>
-          <w:rFonts w:ascii="Times New Roman" w:cs="Times New Roman" w:eastAsia="Times New Roman" w:hAnsi="Times New Roman"/>
-          <w:sz w:val="24"/>
-          <w:szCs w:val="24"/>
-        </w:rPr>
-        <w:t xml:space="preserve">Existe uma leitura equivocada do princípio que precisa ser afastada explicitamente, porque aparece até em petições.</w:t>
-      </w:r>
-    </w:p>
-    <w:p>
-      <w:pPr>
-        <w:spacing w:line="360" w:lineRule="auto"/>
-        <w:ind w:firstLine="709"/>
-        <w:jc w:val="both"/>
-      </w:pPr>
-      <w:r>
-        <w:rPr>
-          <w:rFonts w:ascii="Times New Roman" w:cs="Times New Roman" w:eastAsia="Times New Roman" w:hAnsi="Times New Roman"/>
-          <w:sz w:val="24"/>
-          <w:szCs w:val="24"/>
-        </w:rPr>
-        <w:t xml:space="preserve">Lido às pressas, "poluidor-pagador" sugeriria que quem paga pode poluir. A inversão tem nome na doutrina. Registram Moreira, Lima e Moreira que, "para Nicolas de Sadeleer, o poluidor não pode pensar que, se paga, tem o direito de poluir, o que seria distorcer o princípio em “pagador-poluidor”, ao invés de “poluidor-pagador”" (MOREIRA; LIMA; MOREIRA, 2019, p. 372).</w:t>
-      </w:r>
-    </w:p>
-    <w:p>
-      <w:pPr>
-        <w:spacing w:line="360" w:lineRule="auto"/>
-        <w:ind w:firstLine="709"/>
-        <w:jc w:val="both"/>
-      </w:pPr>
-      <w:r>
-        <w:rPr>
-          <w:rFonts w:ascii="Times New Roman" w:cs="Times New Roman" w:eastAsia="Times New Roman" w:hAnsi="Times New Roman"/>
-          <w:sz w:val="24"/>
-          <w:szCs w:val="24"/>
-        </w:rPr>
-        <w:t xml:space="preserve">A recusa dessa leitura é firme na doutrina brasileira. Marcelo Abelha Rodrigues, citado pelas mesmas autoras, sustenta que o princípio passa longe do sentido de "pago para poder poluir", não apenas porque o custo ambiental não encontra valoração pecuniária correspondente, mas "também porque a ninguém poderia ser dada a possibilidade de comprar o direito de poluir, beneficiando-se do bem ambiental em detrimento da coletividade que dele é titular" (RODRIGUES apud MOREIRA; LIMA; MOREIRA, 2019, p. 372).</w:t>
-      </w:r>
-    </w:p>
-    <w:p>
-      <w:pPr>
-        <w:spacing w:line="360" w:lineRule="auto"/>
-        <w:ind w:firstLine="709"/>
-        <w:jc w:val="both"/>
-      </w:pPr>
-      <w:r>
-        <w:rPr>
-          <w:rFonts w:ascii="Times New Roman" w:cs="Times New Roman" w:eastAsia="Times New Roman" w:hAnsi="Times New Roman"/>
-          <w:sz w:val="24"/>
-          <w:szCs w:val="24"/>
-        </w:rPr>
-        <w:t xml:space="preserve">O argumento é duplo e vale a pena separá-lo. O primeiro é de ordem prática: não há preço que corresponda ao bem perdido, de modo que o pagamento nunca equivale à degradação. O segundo é de ordem estrutural e mais forte: o meio ambiente é bem de uso comum do povo, e ninguém compra o que não pertence ao vendedor. O princípio incide sobre a poluição juridicamente tolerada — a que se mantém dentro dos padrões legais e das condições da licença — e não sobre o ilícito, que continua sujeito a sanção administrativa e penal, além do dever de reparar. Pagar não convalida ilicitude. Quem degrada sem licença, ou além dos limites da que possui, não comprou nada: apenas passou a dever mais.</w:t>
-      </w:r>
-    </w:p>
-    <w:p>
-      <w:pPr>
-        <w:spacing w:after="240" w:before="360" w:line="360" w:lineRule="auto"/>
-        <w:jc w:val="left"/>
-      </w:pPr>
-      <w:r>
-        <w:rPr>
-          <w:rFonts w:ascii="Times New Roman" w:cs="Times New Roman" w:eastAsia="Times New Roman" w:hAnsi="Times New Roman"/>
-          <w:b/>
-          <w:bCs/>
-          <w:sz w:val="24"/>
-          <w:szCs w:val="24"/>
-        </w:rPr>
-        <w:t xml:space="preserve">5 A APLICAÇÃO CONCRETA: O REsp 1.198.727/MG</w:t>
-      </w:r>
-    </w:p>
-    <w:p>
-      <w:pPr>
-        <w:spacing w:line="360" w:lineRule="auto"/>
-        <w:ind w:firstLine="709"/>
-        <w:jc w:val="both"/>
-      </w:pPr>
-      <w:r>
-        <w:rPr>
-          <w:rFonts w:ascii="Times New Roman" w:cs="Times New Roman" w:eastAsia="Times New Roman" w:hAnsi="Times New Roman"/>
-          <w:sz w:val="24"/>
-          <w:szCs w:val="24"/>
-        </w:rPr>
-        <w:t xml:space="preserve">O julgamento do Recurso Especial n. 1.198.727/MG pela Segunda Turma do Superior Tribunal de Justiça, sob relatoria do Ministro Herman Benjamin, em 14 de agosto de 2012, com acórdão publicado no DJe de 9 de maio de 2013, mostra o princípio operando dentro do processo.</w:t>
-      </w:r>
-    </w:p>
-    <w:p>
-      <w:pPr>
-        <w:spacing w:line="360" w:lineRule="auto"/>
-        <w:ind w:firstLine="709"/>
-        <w:jc w:val="both"/>
-      </w:pPr>
-      <w:r>
-        <w:rPr>
-          <w:rFonts w:ascii="Times New Roman" w:cs="Times New Roman" w:eastAsia="Times New Roman" w:hAnsi="Times New Roman"/>
-          <w:sz w:val="24"/>
-          <w:szCs w:val="24"/>
-        </w:rPr>
-        <w:t xml:space="preserve">O caso teve origem em ação civil pública ajuizada em razão do desmatamento de vegetação nativa de Cerrado, sem autorização do órgão ambiental competente. A controvérsia era objetiva: condenado o réu a recuperar a área degradada, poderia ser condenado, cumulativamente, a indenizar em dinheiro? Ou a recuperação esgotaria a reparação devida, configurando a cumulação um bis in idem?</w:t>
-      </w:r>
-    </w:p>
-    <w:p>
-      <w:pPr>
-        <w:spacing w:line="360" w:lineRule="auto"/>
-        <w:ind w:firstLine="709"/>
-        <w:jc w:val="both"/>
-      </w:pPr>
-      <w:r>
-        <w:rPr>
-          <w:rFonts w:ascii="Times New Roman" w:cs="Times New Roman" w:eastAsia="Times New Roman" w:hAnsi="Times New Roman"/>
-          <w:sz w:val="24"/>
-          <w:szCs w:val="24"/>
-        </w:rPr>
-        <w:t xml:space="preserve">O obstáculo era textual. O art. 4º, VII, da Lei n. 6.938/1981 fala em recuperar "e/ou" indenizar, e o réu sustentava que a conjunção alternativa excluiria a soma. O Tribunal rejeitou a leitura literal:</w:t>
-      </w:r>
-    </w:p>
-    <w:p>
-      <w:pPr>
-        <w:spacing w:after="240" w:before="240" w:line="240" w:lineRule="auto"/>
-        <w:ind w:left="2268"/>
-        <w:jc w:val="both"/>
-      </w:pPr>
-      <w:r>
-        <w:rPr>
-          <w:rFonts w:ascii="Times New Roman" w:cs="Times New Roman" w:eastAsia="Times New Roman" w:hAnsi="Times New Roman"/>
-          <w:sz w:val="20"/>
-          <w:szCs w:val="20"/>
-        </w:rPr>
-        <w:t xml:space="preserve">a conjunção “ou” contida na citada norma (assim como nos arts. 4º, VII, e 14, § 1º, da Lei 6.938/1981) opera com valor aditivo, não introduz alternativa excludente. Vedar a cumulação desses remédios limitaria, de forma indesejada, a Ação Civil Pública, instrumento de persecução da responsabilidade civil de danos causados ao meio ambiente, por exemplo inviabilizando a condenação em dano moral coletivo. (STJ, REsp 1.198.727/MG, Rel. Min. Herman Benjamin, 2ª Turma, j. 14 ago. 2012)</w:t>
-      </w:r>
-    </w:p>
-    <w:p>
-      <w:pPr>
-        <w:spacing w:line="360" w:lineRule="auto"/>
-        <w:ind w:firstLine="709"/>
-        <w:jc w:val="both"/>
-      </w:pPr>
-      <w:r>
-        <w:rPr>
-          <w:rFonts w:ascii="Times New Roman" w:cs="Times New Roman" w:eastAsia="Times New Roman" w:hAnsi="Times New Roman"/>
-          <w:sz w:val="24"/>
-          <w:szCs w:val="24"/>
-        </w:rPr>
-        <w:t xml:space="preserve">A decisão fundou-se nos princípios da reparação integral, do poluidor-pagador e do usuário-pagador. E o raciocínio é coerente com tudo o que se expôs até aqui: replantar não repõe o que se perdeu. Entre o desmatamento e a recomposição efetiva da vegetação decorre um período que, no Cerrado, se conta em décadas, e durante todo esse intervalo a coletividade fica privada dos serviços ecossistêmicos que a área prestava.</w:t>
-      </w:r>
-    </w:p>
-    <w:p>
-      <w:pPr>
-        <w:spacing w:line="360" w:lineRule="auto"/>
-        <w:ind w:firstLine="709"/>
-        <w:jc w:val="both"/>
-      </w:pPr>
-      <w:r>
-        <w:rPr>
-          <w:rFonts w:ascii="Times New Roman" w:cs="Times New Roman" w:eastAsia="Times New Roman" w:hAnsi="Times New Roman"/>
-          <w:sz w:val="24"/>
-          <w:szCs w:val="24"/>
-        </w:rPr>
-        <w:t xml:space="preserve">O Superior Tribunal de Justiça deu nome a essa parcela do prejuízo. Em julgado da mesma linha, assentou:</w:t>
-      </w:r>
-    </w:p>
-    <w:p>
-      <w:pPr>
-        <w:spacing w:after="240" w:before="240" w:line="240" w:lineRule="auto"/>
-        <w:ind w:left="2268"/>
-        <w:jc w:val="both"/>
-      </w:pPr>
-      <w:r>
-        <w:rPr>
-          <w:rFonts w:ascii="Times New Roman" w:cs="Times New Roman" w:eastAsia="Times New Roman" w:hAnsi="Times New Roman"/>
-          <w:sz w:val="20"/>
-          <w:szCs w:val="20"/>
-        </w:rPr>
-        <w:t xml:space="preserve">A reparação ambiental deve ser feita da forma mais completa possível, de modo que a condenação a recuperar a área lesionada não exclui o dever de indenizar, sobretudo pelo dano que permanece entre a sua ocorrência e o pleno restabelecimento do meio ambiente afetado (= dano interino ou intermediário), bem como pelo dano moral coletivo e pelo dano residual (= degradação ambiental que subsiste, não obstante todos os esforços de restauração). (STJ, REsp 1.180.078/MG, Rel. Min. Herman Benjamin, 2ª Turma)</w:t>
-      </w:r>
-    </w:p>
-    <w:p>
-      <w:pPr>
-        <w:spacing w:line="360" w:lineRule="auto"/>
-        <w:ind w:firstLine="709"/>
-        <w:jc w:val="both"/>
-      </w:pPr>
-      <w:r>
-        <w:rPr>
-          <w:rFonts w:ascii="Times New Roman" w:cs="Times New Roman" w:eastAsia="Times New Roman" w:hAnsi="Times New Roman"/>
-          <w:sz w:val="24"/>
-          <w:szCs w:val="24"/>
-        </w:rPr>
-        <w:t xml:space="preserve">Dano interino e dano residual são, em rigor, custos ambientais que a obrigação de fazer não alcança. Se a condenação parasse no replantio, essa parcela permaneceria externalizada, suportada por quem não a causou. A cumulação, portanto, não é excesso punitivo: é exigência do princípio.</w:t>
-      </w:r>
-    </w:p>
-    <w:p>
-      <w:pPr>
-        <w:spacing w:line="360" w:lineRule="auto"/>
-        <w:ind w:firstLine="709"/>
-        <w:jc w:val="both"/>
-      </w:pPr>
-      <w:r>
-        <w:rPr>
-          <w:rFonts w:ascii="Times New Roman" w:cs="Times New Roman" w:eastAsia="Times New Roman" w:hAnsi="Times New Roman"/>
-          <w:sz w:val="24"/>
-          <w:szCs w:val="24"/>
-        </w:rPr>
-        <w:t xml:space="preserve">O entendimento consolidou-se em enunciados que hoje estruturam a matéria. A Súmula 629 firma que, quanto ao dano ambiental, é admitida a condenação do réu à obrigação de fazer ou à de não fazer cumulada com a de indenizar. A Súmula 623 reconhece a natureza propter rem das obrigações ambientais, permitindo exigi-las do proprietário ou possuidor atual e/ou dos anteriores, à escolha do credor — solução que impede a fuga da responsabilidade pela simples venda do imóvel degradado. E a Súmula 618 atribui ao réu o ônus da prova nas ações de degradação ambiental, derrubando a barreira probatória que na prática inviabilizava a responsabilização.</w:t>
-      </w:r>
-    </w:p>
-    <w:p>
-      <w:pPr>
-        <w:spacing w:line="360" w:lineRule="auto"/>
-        <w:ind w:firstLine="709"/>
-        <w:jc w:val="both"/>
-      </w:pPr>
-      <w:r>
-        <w:rPr>
-          <w:rFonts w:ascii="Times New Roman" w:cs="Times New Roman" w:eastAsia="Times New Roman" w:hAnsi="Times New Roman"/>
-          <w:sz w:val="24"/>
-          <w:szCs w:val="24"/>
-        </w:rPr>
-        <w:t xml:space="preserve">Vistos em conjunto, os três enunciados fazem o que o princípio pede: impedem que o custo ambiental escape do agente por via processual, registral ou probatória.</w:t>
-      </w:r>
-    </w:p>
-    <w:p>
-      <w:pPr>
-        <w:spacing w:after="240" w:before="360" w:line="360" w:lineRule="auto"/>
-        <w:jc w:val="left"/>
-      </w:pPr>
-      <w:r>
-        <w:rPr>
-          <w:rFonts w:ascii="Times New Roman" w:cs="Times New Roman" w:eastAsia="Times New Roman" w:hAnsi="Times New Roman"/>
-          <w:b/>
-          <w:bCs/>
-          <w:sz w:val="24"/>
-          <w:szCs w:val="24"/>
-        </w:rPr>
-        <w:t xml:space="preserve">6 CONCLUSÃO</w:t>
-      </w:r>
-    </w:p>
-    <w:p>
-      <w:pPr>
-        <w:spacing w:line="360" w:lineRule="auto"/>
-        <w:ind w:firstLine="709"/>
-        <w:jc w:val="both"/>
-      </w:pPr>
-      <w:r>
-        <w:rPr>
-          <w:rFonts w:ascii="Times New Roman" w:cs="Times New Roman" w:eastAsia="Times New Roman" w:hAnsi="Times New Roman"/>
-          <w:sz w:val="24"/>
-          <w:szCs w:val="24"/>
-        </w:rPr>
-        <w:t xml:space="preserve">O poluidor-pagador não é uma regra sobre quem paga a conta. É mecanismo de correção de falha de mercado. Sem ele, o preço dos bens produzidos não expressa seu custo real, e a degradação segue sendo a escolha racional para o agente econômico.</w:t>
-      </w:r>
-    </w:p>
-    <w:p>
-      <w:pPr>
-        <w:spacing w:line="360" w:lineRule="auto"/>
-        <w:ind w:firstLine="709"/>
-        <w:jc w:val="both"/>
-      </w:pPr>
-      <w:r>
-        <w:rPr>
-          <w:rFonts w:ascii="Times New Roman" w:cs="Times New Roman" w:eastAsia="Times New Roman" w:hAnsi="Times New Roman"/>
-          <w:sz w:val="24"/>
-          <w:szCs w:val="24"/>
-        </w:rPr>
-        <w:t xml:space="preserve">O REsp 1.198.727/MG mostra o princípio cumprindo essa função dentro do processo civil. Ao ler o "ou" legal como conjunção aditiva, o STJ recusou uma reparação apenas aparente e alocou integralmente o custo ambiental em quem o gerou. As Súmulas 618, 623 e 629 estenderam a lógica ao regime probatório e à transmissibilidade da obrigação. No plano normativo e jurisprudencial, o sistema brasileiro de responsabilidade civil ambiental tornou-se bastante robusto.</w:t>
-      </w:r>
-    </w:p>
-    <w:p>
-      <w:pPr>
-        <w:spacing w:line="360" w:lineRule="auto"/>
-        <w:ind w:firstLine="709"/>
-        <w:jc w:val="both"/>
-      </w:pPr>
-      <w:r>
-        <w:rPr>
-          <w:rFonts w:ascii="Times New Roman" w:cs="Times New Roman" w:eastAsia="Times New Roman" w:hAnsi="Times New Roman"/>
-          <w:sz w:val="24"/>
-          <w:szCs w:val="24"/>
-        </w:rPr>
-        <w:t xml:space="preserve">Cabe, porém, um registro crítico que a própria pesquisa consultada autoriza. Moreira, Lima e Moreira concluem que, embora o princípio tenha sido bem incorporado como fio condutor da reparação integral, sua dimensão preventiva permanece significativamente subutilizada pelos tribunais superiores (MOREIRA; LIMA; MOREIRA, 2019, p. 368). O dado é revelador quando se lembra que, na formulação original da OCDE, em 1972, prevenção era tudo o que o princípio exigia. Construímos um sistema eficiente para cobrar depois, e comparativamente tímido para impedir antes.</w:t>
-      </w:r>
-    </w:p>
-    <w:p>
-      <w:pPr>
-        <w:spacing w:line="360" w:lineRule="auto"/>
-        <w:ind w:firstLine="709"/>
-        <w:jc w:val="both"/>
-      </w:pPr>
-      <w:r>
-        <w:rPr>
-          <w:rFonts w:ascii="Times New Roman" w:cs="Times New Roman" w:eastAsia="Times New Roman" w:hAnsi="Times New Roman"/>
-          <w:sz w:val="24"/>
-          <w:szCs w:val="24"/>
-        </w:rPr>
-        <w:t xml:space="preserve">A observação encontra eco no próprio Curso. Ao tratar dos serviços prestados pelos ecossistemas, Sarlet e Fensterseifer registram que "discute-se, cada vez mais, inclusive como princípio e dever jurídico, a priorização de soluções baseadas na Natureza, o que coaduna, por exemplo, com uma ética do cuidado e da prevenção e precaução de danos ao meio ambiente, inclusive em vista do futuro" (SARLET; FENSTERSEIFER, 2026, p. ___). Prevenir, nessa leitura, não é alternativa mais barata à reparação: é o próprio conteúdo do dever.</w:t>
-      </w:r>
-    </w:p>
-    <w:p>
-      <w:pPr>
-        <w:spacing w:line="360" w:lineRule="auto"/>
-        <w:ind w:firstLine="709"/>
-        <w:jc w:val="both"/>
-      </w:pPr>
-      <w:r>
-        <w:rPr>
-          <w:rFonts w:ascii="Times New Roman" w:cs="Times New Roman" w:eastAsia="Times New Roman" w:hAnsi="Times New Roman"/>
-          <w:sz w:val="24"/>
-          <w:szCs w:val="24"/>
-        </w:rPr>
-        <w:t xml:space="preserve">Some-se a isso a dificuldade de quantificar. Não há metodologia consolidada para medir o dano interino e converter em reais os serviços ecossistêmicos perdidos durante a regeneração. E aqui a questão volta ao ponto de partida. Enquanto a Natureza continuar sendo contabilizada como fornecedora gratuita, faltará ao juiz o parâmetro para calcular o que o poluidor deve. Sem preço, não há internalização — e a reparação integral corre o risco de permanecer, em boa medida, uma promessa bem escrita.</w:t>
-      </w:r>
-    </w:p>
-    <w:p>
-      <w:pPr>
-        <w:spacing w:after="240" w:before="360" w:line="360" w:lineRule="auto"/>
-        <w:jc w:val="left"/>
-      </w:pPr>
-      <w:r>
-        <w:rPr>
-          <w:rFonts w:ascii="Times New Roman" w:cs="Times New Roman" w:eastAsia="Times New Roman" w:hAnsi="Times New Roman"/>
-          <w:b/>
-          <w:bCs/>
-          <w:sz w:val="24"/>
-          <w:szCs w:val="24"/>
-        </w:rPr>
         <w:t xml:space="preserve">REFERÊNCIAS</w:t>
       </w:r>
     </w:p>
@@ -936,7 +921,7 @@
           <w:sz w:val="24"/>
           <w:szCs w:val="24"/>
         </w:rPr>
-        <w:t xml:space="preserve">. 6. ed. Rio de Janeiro: Forense, 2026. p. ___.</w:t>
+        <w:t xml:space="preserve">. 6. ed. Rio de Janeiro: Forense, 2026.</w:t>
       </w:r>
     </w:p>
     <w:sectPr>

</xml_diff>